<commit_message>
Add C2 phone policy proposal to frontend v6 manual
Co-Authored-By: Claude Opus 5.5 <noreply@anthropic.com>
</commit_message>
<xml_diff>
--- a/frontend/docs/frontend-v6-manual.docx
+++ b/frontend/docs/frontend-v6-manual.docx
@@ -123,7 +123,7 @@
         <w:spacing w:after="60"/>
       </w:pPr>
       <w:r>
-        <w:t xml:space="preserve">추가 협의 C1·C3·C4는 각 항목의 추천안으로 프론트를 맞췄습니다. C2는 현재 v6 정책 기준으로 연결했고, 정책 확정은 프론트 담당이 별도로 협의드릴 예정입니다. C5·C6는 회신하지 않았습니다(6절 참고).</w:t>
+        <w:t xml:space="preserve">추가 협의 C1·C3·C4는 각 항목의 추천안으로 프론트를 맞췄습니다. C2는 현재 v6 정책 기준으로 연결했고, 프론트 의견과 회신 요청을 2-2절에 정리했습니다. C5·C6는 회신하지 않았습니다(6절 참고).</w:t>
       </w:r>
     </w:p>
     <w:p>
@@ -542,19 +542,19 @@
           <w:p>
             <w:r>
               <w:rPr>
-                <w:sz w:val="18"/>
-                <w:szCs w:val="18"/>
-              </w:rPr>
-              <w:t xml:space="preserve">번호 범위, 동일 번호 다중 가입 허용 여부는 </w:t>
-            </w:r>
-            <w:r>
-              <w:rPr>
                 <w:b/>
                 <w:bCs/>
                 <w:sz w:val="18"/>
                 <w:szCs w:val="18"/>
               </w:rPr>
-              <w:t xml:space="preserve">프론트 담당이 별도 협의 예정</w:t>
+              <w:t xml:space="preserve">회신 요청</w:t>
+            </w:r>
+            <w:r>
+              <w:rPr>
+                <w:sz w:val="18"/>
+                <w:szCs w:val="18"/>
+              </w:rPr>
+              <w:t xml:space="preserve"> (2-2절). 프론트 제안: 현재 v6 유지로 확정</w:t>
             </w:r>
           </w:p>
         </w:tc>
@@ -786,7 +786,7 @@
         <w:pStyle w:val="Heading2"/>
       </w:pPr>
       <w:r>
-        <w:t xml:space="preserve">C4 항목별 프론트 조치</w:t>
+        <w:t xml:space="preserve">2-1. C4 항목별 프론트 조치</w:t>
       </w:r>
     </w:p>
     <w:tbl>
@@ -1335,6 +1335,892 @@
     </w:p>
     <w:p>
       <w:pPr>
+        <w:pStyle w:val="Heading2"/>
+      </w:pPr>
+      <w:r>
+        <w:t xml:space="preserve">2-2. C2 전화번호 정책: 프론트 의견과 회신 요청</w:t>
+      </w:r>
+    </w:p>
+    <w:p>
+      <w:pPr>
+        <w:spacing w:after="120"/>
+      </w:pPr>
+      <w:r>
+        <w:t xml:space="preserve">원 요청 1번에서 물었던 두 가지(받을 번호 범위, 같은 번호로 여러 아이디 가입 허용 여부)를 확정해 주세요. 프론트는 지금 현재 v6 동작 그대로 연결해 두었습니다.</w:t>
+      </w:r>
+    </w:p>
+    <w:tbl>
+      <w:tblPr>
+        <w:tblW w:type="dxa" w:w="9638"/>
+        <w:tblBorders>
+          <w:top w:val="single" w:color="auto" w:sz="4"/>
+          <w:left w:val="single" w:color="auto" w:sz="4"/>
+          <w:bottom w:val="single" w:color="auto" w:sz="4"/>
+          <w:right w:val="single" w:color="auto" w:sz="4"/>
+          <w:insideH w:val="single" w:color="auto" w:sz="4"/>
+          <w:insideV w:val="single" w:color="auto" w:sz="4"/>
+        </w:tblBorders>
+      </w:tblPr>
+      <w:tblGrid>
+        <w:gridCol w:w="1927"/>
+        <w:gridCol w:w="7711"/>
+      </w:tblGrid>
+      <w:tr>
+        <w:trPr>
+          <w:tblHeader/>
+        </w:trPr>
+        <w:tc>
+          <w:tcPr>
+            <w:tcW w:type="dxa" w:w="1927"/>
+            <w:tcBorders>
+              <w:top w:val="single" w:color="C9CED8" w:sz="4"/>
+              <w:left w:val="single" w:color="C9CED8" w:sz="4"/>
+              <w:bottom w:val="single" w:color="C9CED8" w:sz="4"/>
+              <w:right w:val="single" w:color="C9CED8" w:sz="4"/>
+            </w:tcBorders>
+            <w:shd w:fill="E7EAF0" w:color="auto" w:val="clear"/>
+            <w:tcMar>
+              <w:top w:type="dxa" w:w="60"/>
+              <w:left w:type="dxa" w:w="100"/>
+              <w:bottom w:type="dxa" w:w="60"/>
+              <w:right w:type="dxa" w:w="100"/>
+            </w:tcMar>
+          </w:tcPr>
+          <w:p>
+            <w:r>
+              <w:rPr>
+                <w:b/>
+                <w:bCs/>
+                <w:sz w:val="18"/>
+                <w:szCs w:val="18"/>
+              </w:rPr>
+              <w:t xml:space="preserve">항목</w:t>
+            </w:r>
+          </w:p>
+        </w:tc>
+        <w:tc>
+          <w:tcPr>
+            <w:tcW w:type="dxa" w:w="7711"/>
+            <w:tcBorders>
+              <w:top w:val="single" w:color="C9CED8" w:sz="4"/>
+              <w:left w:val="single" w:color="C9CED8" w:sz="4"/>
+              <w:bottom w:val="single" w:color="C9CED8" w:sz="4"/>
+              <w:right w:val="single" w:color="C9CED8" w:sz="4"/>
+            </w:tcBorders>
+            <w:shd w:fill="E7EAF0" w:color="auto" w:val="clear"/>
+            <w:tcMar>
+              <w:top w:type="dxa" w:w="60"/>
+              <w:left w:type="dxa" w:w="100"/>
+              <w:bottom w:type="dxa" w:w="60"/>
+              <w:right w:type="dxa" w:w="100"/>
+            </w:tcMar>
+          </w:tcPr>
+          <w:p>
+            <w:r>
+              <w:rPr>
+                <w:b/>
+                <w:bCs/>
+                <w:sz w:val="18"/>
+                <w:szCs w:val="18"/>
+              </w:rPr>
+              <w:t xml:space="preserve">현재 v6 동작</w:t>
+            </w:r>
+          </w:p>
+        </w:tc>
+      </w:tr>
+      <w:tr>
+        <w:tc>
+          <w:tcPr>
+            <w:tcW w:type="dxa" w:w="1927"/>
+            <w:tcBorders>
+              <w:top w:val="single" w:color="C9CED8" w:sz="4"/>
+              <w:left w:val="single" w:color="C9CED8" w:sz="4"/>
+              <w:bottom w:val="single" w:color="C9CED8" w:sz="4"/>
+              <w:right w:val="single" w:color="C9CED8" w:sz="4"/>
+            </w:tcBorders>
+            <w:tcMar>
+              <w:top w:type="dxa" w:w="60"/>
+              <w:left w:type="dxa" w:w="100"/>
+              <w:bottom w:type="dxa" w:w="60"/>
+              <w:right w:type="dxa" w:w="100"/>
+            </w:tcMar>
+          </w:tcPr>
+          <w:p>
+            <w:r>
+              <w:rPr>
+                <w:sz w:val="18"/>
+                <w:szCs w:val="18"/>
+              </w:rPr>
+              <w:t xml:space="preserve">번호 형식</w:t>
+            </w:r>
+          </w:p>
+        </w:tc>
+        <w:tc>
+          <w:tcPr>
+            <w:tcW w:type="dxa" w:w="7711"/>
+            <w:tcBorders>
+              <w:top w:val="single" w:color="C9CED8" w:sz="4"/>
+              <w:left w:val="single" w:color="C9CED8" w:sz="4"/>
+              <w:bottom w:val="single" w:color="C9CED8" w:sz="4"/>
+              <w:right w:val="single" w:color="C9CED8" w:sz="4"/>
+            </w:tcBorders>
+            <w:tcMar>
+              <w:top w:type="dxa" w:w="60"/>
+              <w:left w:type="dxa" w:w="100"/>
+              <w:bottom w:type="dxa" w:w="60"/>
+              <w:right w:type="dxa" w:w="100"/>
+            </w:tcMar>
+          </w:tcPr>
+          <w:p>
+            <w:r>
+              <w:rPr>
+                <w:sz w:val="18"/>
+                <w:szCs w:val="18"/>
+              </w:rPr>
+              <w:t xml:space="preserve">공백·하이픈 제거, </w:t>
+            </w:r>
+            <w:r>
+              <w:rPr>
+                <w:rFonts w:ascii="Consolas" w:cs="Consolas" w:eastAsia="Consolas" w:hAnsi="Consolas"/>
+                <w:sz w:val="17"/>
+                <w:szCs w:val="17"/>
+              </w:rPr>
+              <w:t xml:space="preserve">010…</w:t>
+            </w:r>
+            <w:r>
+              <w:rPr>
+                <w:sz w:val="18"/>
+                <w:szCs w:val="18"/>
+              </w:rPr>
+              <w:t xml:space="preserve"> → </w:t>
+            </w:r>
+            <w:r>
+              <w:rPr>
+                <w:rFonts w:ascii="Consolas" w:cs="Consolas" w:eastAsia="Consolas" w:hAnsi="Consolas"/>
+                <w:sz w:val="17"/>
+                <w:szCs w:val="17"/>
+              </w:rPr>
+              <w:t xml:space="preserve">+8210…</w:t>
+            </w:r>
+            <w:r>
+              <w:rPr>
+                <w:sz w:val="18"/>
+                <w:szCs w:val="18"/>
+              </w:rPr>
+              <w:t xml:space="preserve"> 저장. 국제 형식(</w:t>
+            </w:r>
+            <w:r>
+              <w:rPr>
+                <w:rFonts w:ascii="Consolas" w:cs="Consolas" w:eastAsia="Consolas" w:hAnsi="Consolas"/>
+                <w:sz w:val="17"/>
+                <w:szCs w:val="17"/>
+              </w:rPr>
+              <w:t xml:space="preserve">+1…</w:t>
+            </w:r>
+            <w:r>
+              <w:rPr>
+                <w:sz w:val="18"/>
+                <w:szCs w:val="18"/>
+              </w:rPr>
+              <w:t xml:space="preserve"> 등)도 허용</w:t>
+            </w:r>
+          </w:p>
+        </w:tc>
+      </w:tr>
+      <w:tr>
+        <w:tc>
+          <w:tcPr>
+            <w:tcW w:type="dxa" w:w="1927"/>
+            <w:tcBorders>
+              <w:top w:val="single" w:color="C9CED8" w:sz="4"/>
+              <w:left w:val="single" w:color="C9CED8" w:sz="4"/>
+              <w:bottom w:val="single" w:color="C9CED8" w:sz="4"/>
+              <w:right w:val="single" w:color="C9CED8" w:sz="4"/>
+            </w:tcBorders>
+            <w:tcMar>
+              <w:top w:type="dxa" w:w="60"/>
+              <w:left w:type="dxa" w:w="100"/>
+              <w:bottom w:type="dxa" w:w="60"/>
+              <w:right w:type="dxa" w:w="100"/>
+            </w:tcMar>
+          </w:tcPr>
+          <w:p>
+            <w:r>
+              <w:rPr>
+                <w:sz w:val="18"/>
+                <w:szCs w:val="18"/>
+              </w:rPr>
+              <w:t xml:space="preserve">중복</w:t>
+            </w:r>
+          </w:p>
+        </w:tc>
+        <w:tc>
+          <w:tcPr>
+            <w:tcW w:type="dxa" w:w="7711"/>
+            <w:tcBorders>
+              <w:top w:val="single" w:color="C9CED8" w:sz="4"/>
+              <w:left w:val="single" w:color="C9CED8" w:sz="4"/>
+              <w:bottom w:val="single" w:color="C9CED8" w:sz="4"/>
+              <w:right w:val="single" w:color="C9CED8" w:sz="4"/>
+            </w:tcBorders>
+            <w:tcMar>
+              <w:top w:type="dxa" w:w="60"/>
+              <w:left w:type="dxa" w:w="100"/>
+              <w:bottom w:type="dxa" w:w="60"/>
+              <w:right w:type="dxa" w:w="100"/>
+            </w:tcMar>
+          </w:tcPr>
+          <w:p>
+            <w:r>
+              <w:rPr>
+                <w:sz w:val="18"/>
+                <w:szCs w:val="18"/>
+              </w:rPr>
+              <w:t xml:space="preserve">같은 번호로 여러 아이디 가입 가능 (연락처 고유 제약 없음). 아이디 중복만 </w:t>
+            </w:r>
+            <w:r>
+              <w:rPr>
+                <w:rFonts w:ascii="Consolas" w:cs="Consolas" w:eastAsia="Consolas" w:hAnsi="Consolas"/>
+                <w:sz w:val="17"/>
+                <w:szCs w:val="17"/>
+              </w:rPr>
+              <w:t xml:space="preserve">409 DUPLICATE_USERNAME</w:t>
+            </w:r>
+          </w:p>
+        </w:tc>
+      </w:tr>
+      <w:tr>
+        <w:tc>
+          <w:tcPr>
+            <w:tcW w:type="dxa" w:w="1927"/>
+            <w:tcBorders>
+              <w:top w:val="single" w:color="C9CED8" w:sz="4"/>
+              <w:left w:val="single" w:color="C9CED8" w:sz="4"/>
+              <w:bottom w:val="single" w:color="C9CED8" w:sz="4"/>
+              <w:right w:val="single" w:color="C9CED8" w:sz="4"/>
+            </w:tcBorders>
+            <w:tcMar>
+              <w:top w:type="dxa" w:w="60"/>
+              <w:left w:type="dxa" w:w="100"/>
+              <w:bottom w:type="dxa" w:w="60"/>
+              <w:right w:type="dxa" w:w="100"/>
+            </w:tcMar>
+          </w:tcPr>
+          <w:p>
+            <w:r>
+              <w:rPr>
+                <w:sz w:val="18"/>
+                <w:szCs w:val="18"/>
+              </w:rPr>
+              <w:t xml:space="preserve">이름</w:t>
+            </w:r>
+          </w:p>
+        </w:tc>
+        <w:tc>
+          <w:tcPr>
+            <w:tcW w:type="dxa" w:w="7711"/>
+            <w:tcBorders>
+              <w:top w:val="single" w:color="C9CED8" w:sz="4"/>
+              <w:left w:val="single" w:color="C9CED8" w:sz="4"/>
+              <w:bottom w:val="single" w:color="C9CED8" w:sz="4"/>
+              <w:right w:val="single" w:color="C9CED8" w:sz="4"/>
+            </w:tcBorders>
+            <w:tcMar>
+              <w:top w:type="dxa" w:w="60"/>
+              <w:left w:type="dxa" w:w="100"/>
+              <w:bottom w:type="dxa" w:w="60"/>
+              <w:right w:type="dxa" w:w="100"/>
+            </w:tcMar>
+          </w:tcPr>
+          <w:p>
+            <w:r>
+              <w:rPr>
+                <w:sz w:val="18"/>
+                <w:szCs w:val="18"/>
+              </w:rPr>
+              <w:t xml:space="preserve">필수·최대 100자 (원 요청의 2~20자 제한은 쓰지 않음 — 프론트도 v6 기준으로 맞춤)</w:t>
+            </w:r>
+          </w:p>
+        </w:tc>
+      </w:tr>
+    </w:tbl>
+    <w:p>
+      <w:pPr>
+        <w:spacing w:after="80"/>
+      </w:pPr>
+    </w:p>
+    <w:p>
+      <w:pPr>
+        <w:spacing w:after="120"/>
+      </w:pPr>
+      <w:r>
+        <w:t xml:space="preserve">프론트가 확인한 영향 범위: v6는 아이디 찾기·비밀번호 재설정을 전화번호가 아니라 계좌 또는 복구 코드로 하고, PIN 재설정의 휴대폰 확인도 본인에게 등록된 번호만 봅니다. 따라서 같은 번호를 쓰는 계정이 여러 개여도 복구 흐름은 깨지지 않습니다. 남는 차이는 "한 사람이 같은 번호로 계정을 여러 개 만들 수 있는가"뿐입니다.</w:t>
+      </w:r>
+    </w:p>
+    <w:tbl>
+      <w:tblPr>
+        <w:tblW w:type="dxa" w:w="9638"/>
+        <w:tblBorders>
+          <w:top w:val="single" w:color="auto" w:sz="4"/>
+          <w:left w:val="single" w:color="auto" w:sz="4"/>
+          <w:bottom w:val="single" w:color="auto" w:sz="4"/>
+          <w:right w:val="single" w:color="auto" w:sz="4"/>
+          <w:insideH w:val="single" w:color="auto" w:sz="4"/>
+          <w:insideV w:val="single" w:color="auto" w:sz="4"/>
+        </w:tblBorders>
+      </w:tblPr>
+      <w:tblGrid>
+        <w:gridCol w:w="1686"/>
+        <w:gridCol w:w="3975"/>
+        <w:gridCol w:w="3977"/>
+      </w:tblGrid>
+      <w:tr>
+        <w:trPr>
+          <w:tblHeader/>
+        </w:trPr>
+        <w:tc>
+          <w:tcPr>
+            <w:tcW w:type="dxa" w:w="1686"/>
+            <w:tcBorders>
+              <w:top w:val="single" w:color="C9CED8" w:sz="4"/>
+              <w:left w:val="single" w:color="C9CED8" w:sz="4"/>
+              <w:bottom w:val="single" w:color="C9CED8" w:sz="4"/>
+              <w:right w:val="single" w:color="C9CED8" w:sz="4"/>
+            </w:tcBorders>
+            <w:shd w:fill="E7EAF0" w:color="auto" w:val="clear"/>
+            <w:tcMar>
+              <w:top w:type="dxa" w:w="60"/>
+              <w:left w:type="dxa" w:w="100"/>
+              <w:bottom w:type="dxa" w:w="60"/>
+              <w:right w:type="dxa" w:w="100"/>
+            </w:tcMar>
+          </w:tcPr>
+          <w:p/>
+        </w:tc>
+        <w:tc>
+          <w:tcPr>
+            <w:tcW w:type="dxa" w:w="3975"/>
+            <w:tcBorders>
+              <w:top w:val="single" w:color="C9CED8" w:sz="4"/>
+              <w:left w:val="single" w:color="C9CED8" w:sz="4"/>
+              <w:bottom w:val="single" w:color="C9CED8" w:sz="4"/>
+              <w:right w:val="single" w:color="C9CED8" w:sz="4"/>
+            </w:tcBorders>
+            <w:shd w:fill="E7EAF0" w:color="auto" w:val="clear"/>
+            <w:tcMar>
+              <w:top w:type="dxa" w:w="60"/>
+              <w:left w:type="dxa" w:w="100"/>
+              <w:bottom w:type="dxa" w:w="60"/>
+              <w:right w:type="dxa" w:w="100"/>
+            </w:tcMar>
+          </w:tcPr>
+          <w:p>
+            <w:r>
+              <w:rPr>
+                <w:b/>
+                <w:bCs/>
+                <w:sz w:val="18"/>
+                <w:szCs w:val="18"/>
+              </w:rPr>
+              <w:t xml:space="preserve">A. 현재 v6 유지 (협의서 추천안)</w:t>
+            </w:r>
+          </w:p>
+        </w:tc>
+        <w:tc>
+          <w:tcPr>
+            <w:tcW w:type="dxa" w:w="3977"/>
+            <w:tcBorders>
+              <w:top w:val="single" w:color="C9CED8" w:sz="4"/>
+              <w:left w:val="single" w:color="C9CED8" w:sz="4"/>
+              <w:bottom w:val="single" w:color="C9CED8" w:sz="4"/>
+              <w:right w:val="single" w:color="C9CED8" w:sz="4"/>
+            </w:tcBorders>
+            <w:shd w:fill="E7EAF0" w:color="auto" w:val="clear"/>
+            <w:tcMar>
+              <w:top w:type="dxa" w:w="60"/>
+              <w:left w:type="dxa" w:w="100"/>
+              <w:bottom w:type="dxa" w:w="60"/>
+              <w:right w:type="dxa" w:w="100"/>
+            </w:tcMar>
+          </w:tcPr>
+          <w:p>
+            <w:r>
+              <w:rPr>
+                <w:b/>
+                <w:bCs/>
+                <w:sz w:val="18"/>
+                <w:szCs w:val="18"/>
+              </w:rPr>
+              <w:t xml:space="preserve">B. 국내 번호만 / 1번호 1계정</w:t>
+            </w:r>
+          </w:p>
+        </w:tc>
+      </w:tr>
+      <w:tr>
+        <w:tc>
+          <w:tcPr>
+            <w:tcW w:type="dxa" w:w="1686"/>
+            <w:tcBorders>
+              <w:top w:val="single" w:color="C9CED8" w:sz="4"/>
+              <w:left w:val="single" w:color="C9CED8" w:sz="4"/>
+              <w:bottom w:val="single" w:color="C9CED8" w:sz="4"/>
+              <w:right w:val="single" w:color="C9CED8" w:sz="4"/>
+            </w:tcBorders>
+            <w:tcMar>
+              <w:top w:type="dxa" w:w="60"/>
+              <w:left w:type="dxa" w:w="100"/>
+              <w:bottom w:type="dxa" w:w="60"/>
+              <w:right w:type="dxa" w:w="100"/>
+            </w:tcMar>
+          </w:tcPr>
+          <w:p>
+            <w:r>
+              <w:rPr>
+                <w:sz w:val="18"/>
+                <w:szCs w:val="18"/>
+              </w:rPr>
+              <w:t xml:space="preserve">백엔드 작업</w:t>
+            </w:r>
+          </w:p>
+        </w:tc>
+        <w:tc>
+          <w:tcPr>
+            <w:tcW w:type="dxa" w:w="3975"/>
+            <w:tcBorders>
+              <w:top w:val="single" w:color="C9CED8" w:sz="4"/>
+              <w:left w:val="single" w:color="C9CED8" w:sz="4"/>
+              <w:bottom w:val="single" w:color="C9CED8" w:sz="4"/>
+              <w:right w:val="single" w:color="C9CED8" w:sz="4"/>
+            </w:tcBorders>
+            <w:tcMar>
+              <w:top w:type="dxa" w:w="60"/>
+              <w:left w:type="dxa" w:w="100"/>
+              <w:bottom w:type="dxa" w:w="60"/>
+              <w:right w:type="dxa" w:w="100"/>
+            </w:tcMar>
+          </w:tcPr>
+          <w:p>
+            <w:r>
+              <w:rPr>
+                <w:sz w:val="18"/>
+                <w:szCs w:val="18"/>
+              </w:rPr>
+              <w:t xml:space="preserve">정책 문구 확정만</w:t>
+            </w:r>
+          </w:p>
+        </w:tc>
+        <w:tc>
+          <w:tcPr>
+            <w:tcW w:type="dxa" w:w="3977"/>
+            <w:tcBorders>
+              <w:top w:val="single" w:color="C9CED8" w:sz="4"/>
+              <w:left w:val="single" w:color="C9CED8" w:sz="4"/>
+              <w:bottom w:val="single" w:color="C9CED8" w:sz="4"/>
+              <w:right w:val="single" w:color="C9CED8" w:sz="4"/>
+            </w:tcBorders>
+            <w:tcMar>
+              <w:top w:type="dxa" w:w="60"/>
+              <w:left w:type="dxa" w:w="100"/>
+              <w:bottom w:type="dxa" w:w="60"/>
+              <w:right w:type="dxa" w:w="100"/>
+            </w:tcMar>
+          </w:tcPr>
+          <w:p>
+            <w:r>
+              <w:rPr>
+                <w:sz w:val="18"/>
+                <w:szCs w:val="18"/>
+              </w:rPr>
+              <w:t xml:space="preserve">형식 제한, 고유 제약, 새 오류 code, 기존 중복 데이터 처리</w:t>
+            </w:r>
+          </w:p>
+        </w:tc>
+      </w:tr>
+      <w:tr>
+        <w:tc>
+          <w:tcPr>
+            <w:tcW w:type="dxa" w:w="1686"/>
+            <w:tcBorders>
+              <w:top w:val="single" w:color="C9CED8" w:sz="4"/>
+              <w:left w:val="single" w:color="C9CED8" w:sz="4"/>
+              <w:bottom w:val="single" w:color="C9CED8" w:sz="4"/>
+              <w:right w:val="single" w:color="C9CED8" w:sz="4"/>
+            </w:tcBorders>
+            <w:tcMar>
+              <w:top w:type="dxa" w:w="60"/>
+              <w:left w:type="dxa" w:w="100"/>
+              <w:bottom w:type="dxa" w:w="60"/>
+              <w:right w:type="dxa" w:w="100"/>
+            </w:tcMar>
+          </w:tcPr>
+          <w:p>
+            <w:r>
+              <w:rPr>
+                <w:sz w:val="18"/>
+                <w:szCs w:val="18"/>
+              </w:rPr>
+              <w:t xml:space="preserve">프론트 작업</w:t>
+            </w:r>
+          </w:p>
+        </w:tc>
+        <w:tc>
+          <w:tcPr>
+            <w:tcW w:type="dxa" w:w="3975"/>
+            <w:tcBorders>
+              <w:top w:val="single" w:color="C9CED8" w:sz="4"/>
+              <w:left w:val="single" w:color="C9CED8" w:sz="4"/>
+              <w:bottom w:val="single" w:color="C9CED8" w:sz="4"/>
+              <w:right w:val="single" w:color="C9CED8" w:sz="4"/>
+            </w:tcBorders>
+            <w:tcMar>
+              <w:top w:type="dxa" w:w="60"/>
+              <w:left w:type="dxa" w:w="100"/>
+              <w:bottom w:type="dxa" w:w="60"/>
+              <w:right w:type="dxa" w:w="100"/>
+            </w:tcMar>
+          </w:tcPr>
+          <w:p>
+            <w:r>
+              <w:rPr>
+                <w:sz w:val="18"/>
+                <w:szCs w:val="18"/>
+              </w:rPr>
+              <w:t xml:space="preserve">없음 (반영 완료)</w:t>
+            </w:r>
+          </w:p>
+        </w:tc>
+        <w:tc>
+          <w:tcPr>
+            <w:tcW w:type="dxa" w:w="3977"/>
+            <w:tcBorders>
+              <w:top w:val="single" w:color="C9CED8" w:sz="4"/>
+              <w:left w:val="single" w:color="C9CED8" w:sz="4"/>
+              <w:bottom w:val="single" w:color="C9CED8" w:sz="4"/>
+              <w:right w:val="single" w:color="C9CED8" w:sz="4"/>
+            </w:tcBorders>
+            <w:tcMar>
+              <w:top w:type="dxa" w:w="60"/>
+              <w:left w:type="dxa" w:w="100"/>
+              <w:bottom w:type="dxa" w:w="60"/>
+              <w:right w:type="dxa" w:w="100"/>
+            </w:tcMar>
+          </w:tcPr>
+          <w:p>
+            <w:r>
+              <w:rPr>
+                <w:sz w:val="18"/>
+                <w:szCs w:val="18"/>
+              </w:rPr>
+              <w:t xml:space="preserve">오류 code 안내 분기, 형식 검증, 목 서버 반영 (작음)</w:t>
+            </w:r>
+          </w:p>
+        </w:tc>
+      </w:tr>
+      <w:tr>
+        <w:tc>
+          <w:tcPr>
+            <w:tcW w:type="dxa" w:w="1686"/>
+            <w:tcBorders>
+              <w:top w:val="single" w:color="C9CED8" w:sz="4"/>
+              <w:left w:val="single" w:color="C9CED8" w:sz="4"/>
+              <w:bottom w:val="single" w:color="C9CED8" w:sz="4"/>
+              <w:right w:val="single" w:color="C9CED8" w:sz="4"/>
+            </w:tcBorders>
+            <w:tcMar>
+              <w:top w:type="dxa" w:w="60"/>
+              <w:left w:type="dxa" w:w="100"/>
+              <w:bottom w:type="dxa" w:w="60"/>
+              <w:right w:type="dxa" w:w="100"/>
+            </w:tcMar>
+          </w:tcPr>
+          <w:p>
+            <w:r>
+              <w:rPr>
+                <w:sz w:val="18"/>
+                <w:szCs w:val="18"/>
+              </w:rPr>
+              <w:t xml:space="preserve">장점</w:t>
+            </w:r>
+          </w:p>
+        </w:tc>
+        <w:tc>
+          <w:tcPr>
+            <w:tcW w:type="dxa" w:w="3975"/>
+            <w:tcBorders>
+              <w:top w:val="single" w:color="C9CED8" w:sz="4"/>
+              <w:left w:val="single" w:color="C9CED8" w:sz="4"/>
+              <w:bottom w:val="single" w:color="C9CED8" w:sz="4"/>
+              <w:right w:val="single" w:color="C9CED8" w:sz="4"/>
+            </w:tcBorders>
+            <w:tcMar>
+              <w:top w:type="dxa" w:w="60"/>
+              <w:left w:type="dxa" w:w="100"/>
+              <w:bottom w:type="dxa" w:w="60"/>
+              <w:right w:type="dxa" w:w="100"/>
+            </w:tcMar>
+          </w:tcPr>
+          <w:p>
+            <w:r>
+              <w:rPr>
+                <w:sz w:val="18"/>
+                <w:szCs w:val="18"/>
+              </w:rPr>
+              <w:t xml:space="preserve">바로 확정, 10.08 일정 부담 없음</w:t>
+            </w:r>
+          </w:p>
+        </w:tc>
+        <w:tc>
+          <w:tcPr>
+            <w:tcW w:type="dxa" w:w="3977"/>
+            <w:tcBorders>
+              <w:top w:val="single" w:color="C9CED8" w:sz="4"/>
+              <w:left w:val="single" w:color="C9CED8" w:sz="4"/>
+              <w:bottom w:val="single" w:color="C9CED8" w:sz="4"/>
+              <w:right w:val="single" w:color="C9CED8" w:sz="4"/>
+            </w:tcBorders>
+            <w:tcMar>
+              <w:top w:type="dxa" w:w="60"/>
+              <w:left w:type="dxa" w:w="100"/>
+              <w:bottom w:type="dxa" w:w="60"/>
+              <w:right w:type="dxa" w:w="100"/>
+            </w:tcMar>
+          </w:tcPr>
+          <w:p>
+            <w:r>
+              <w:rPr>
+                <w:sz w:val="18"/>
+                <w:szCs w:val="18"/>
+              </w:rPr>
+              <w:t xml:space="preserve">실제 은행에 가까움</w:t>
+            </w:r>
+          </w:p>
+        </w:tc>
+      </w:tr>
+      <w:tr>
+        <w:tc>
+          <w:tcPr>
+            <w:tcW w:type="dxa" w:w="1686"/>
+            <w:tcBorders>
+              <w:top w:val="single" w:color="C9CED8" w:sz="4"/>
+              <w:left w:val="single" w:color="C9CED8" w:sz="4"/>
+              <w:bottom w:val="single" w:color="C9CED8" w:sz="4"/>
+              <w:right w:val="single" w:color="C9CED8" w:sz="4"/>
+            </w:tcBorders>
+            <w:tcMar>
+              <w:top w:type="dxa" w:w="60"/>
+              <w:left w:type="dxa" w:w="100"/>
+              <w:bottom w:type="dxa" w:w="60"/>
+              <w:right w:type="dxa" w:w="100"/>
+            </w:tcMar>
+          </w:tcPr>
+          <w:p>
+            <w:r>
+              <w:rPr>
+                <w:sz w:val="18"/>
+                <w:szCs w:val="18"/>
+              </w:rPr>
+              <w:t xml:space="preserve">단점</w:t>
+            </w:r>
+          </w:p>
+        </w:tc>
+        <w:tc>
+          <w:tcPr>
+            <w:tcW w:type="dxa" w:w="3975"/>
+            <w:tcBorders>
+              <w:top w:val="single" w:color="C9CED8" w:sz="4"/>
+              <w:left w:val="single" w:color="C9CED8" w:sz="4"/>
+              <w:bottom w:val="single" w:color="C9CED8" w:sz="4"/>
+              <w:right w:val="single" w:color="C9CED8" w:sz="4"/>
+            </w:tcBorders>
+            <w:tcMar>
+              <w:top w:type="dxa" w:w="60"/>
+              <w:left w:type="dxa" w:w="100"/>
+              <w:bottom w:type="dxa" w:w="60"/>
+              <w:right w:type="dxa" w:w="100"/>
+            </w:tcMar>
+          </w:tcPr>
+          <w:p>
+            <w:r>
+              <w:rPr>
+                <w:sz w:val="18"/>
+                <w:szCs w:val="18"/>
+              </w:rPr>
+              <w:t xml:space="preserve">실제 은행과 다름</w:t>
+            </w:r>
+          </w:p>
+        </w:tc>
+        <w:tc>
+          <w:tcPr>
+            <w:tcW w:type="dxa" w:w="3977"/>
+            <w:tcBorders>
+              <w:top w:val="single" w:color="C9CED8" w:sz="4"/>
+              <w:left w:val="single" w:color="C9CED8" w:sz="4"/>
+              <w:bottom w:val="single" w:color="C9CED8" w:sz="4"/>
+              <w:right w:val="single" w:color="C9CED8" w:sz="4"/>
+            </w:tcBorders>
+            <w:tcMar>
+              <w:top w:type="dxa" w:w="60"/>
+              <w:left w:type="dxa" w:w="100"/>
+              <w:bottom w:type="dxa" w:w="60"/>
+              <w:right w:type="dxa" w:w="100"/>
+            </w:tcMar>
+          </w:tcPr>
+          <w:p>
+            <w:r>
+              <w:rPr>
+                <w:sz w:val="18"/>
+                <w:szCs w:val="18"/>
+              </w:rPr>
+              <w:t xml:space="preserve">10.08 전 백엔드 추가 개발 필요</w:t>
+            </w:r>
+          </w:p>
+        </w:tc>
+      </w:tr>
+    </w:tbl>
+    <w:p>
+      <w:pPr>
+        <w:spacing w:after="80"/>
+      </w:pPr>
+    </w:p>
+    <w:p>
+      <w:pPr>
+        <w:pBdr>
+          <w:left w:val="single" w:color="1F2A44" w:sz="18" w:space="8"/>
+        </w:pBdr>
+        <w:shd w:fill="EEF2FA" w:color="auto" w:val="clear"/>
+        <w:spacing w:after="160" w:before="120"/>
+        <w:ind w:left="120" w:right="120"/>
+      </w:pPr>
+      <w:r>
+        <w:rPr>
+          <w:b/>
+          <w:bCs/>
+        </w:rPr>
+        <w:t xml:space="preserve">프론트 제안: A(현재 v6 유지)로 확정.</w:t>
+      </w:r>
+      <w:r>
+        <w:t xml:space="preserve"> B가 필요하면 10.12 추가 구현 범위로 넘기는 것을 제안합니다. A를 유지하면 "한 번호로 짧은 시간에 여러 계정 생성"을 Splunk 탐지 시나리오 소재로 쓸 수 있습니다. 이 경우 가입 로그에 어떤 항목(정규화 번호의 해시, IP, 시각 등)이 남는지도 함께 알려 주세요.</w:t>
+      </w:r>
+    </w:p>
+    <w:p>
+      <w:pPr>
+        <w:spacing w:after="120"/>
+      </w:pPr>
+      <w:r>
+        <w:rPr>
+          <w:b/>
+          <w:bCs/>
+        </w:rPr>
+        <w:t xml:space="preserve">B를 택하신다면 함께 정해 주세요.</w:t>
+      </w:r>
+    </w:p>
+    <w:p>
+      <w:pPr>
+        <w:pStyle w:val="ListParagraph"/>
+        <w:numPr>
+          <w:ilvl w:val="0"/>
+          <w:numId w:val="2"/>
+        </w:numPr>
+        <w:spacing w:after="60"/>
+      </w:pPr>
+      <w:r>
+        <w:t xml:space="preserve">번호 범위: 010만인지, 011·016 등 옛 번호도 받는지, 국제 형식은 거부하는지</w:t>
+      </w:r>
+    </w:p>
+    <w:p>
+      <w:pPr>
+        <w:pStyle w:val="ListParagraph"/>
+        <w:numPr>
+          <w:ilvl w:val="0"/>
+          <w:numId w:val="2"/>
+        </w:numPr>
+        <w:spacing w:after="60"/>
+      </w:pPr>
+      <w:r>
+        <w:t xml:space="preserve">거부 시점: 인증번호 요청 단계에서 "이미 가입된 번호"를 알려 주면 남이 번호를 넣어 보며 가입 여부를 알아낼 수 있습니다(계정 열거). </w:t>
+      </w:r>
+      <w:r>
+        <w:rPr>
+          <w:b/>
+          <w:bCs/>
+        </w:rPr>
+        <w:t xml:space="preserve">휴대폰 확인을 마친 뒤 가입 제출 시점에 거부</w:t>
+      </w:r>
+      <w:r>
+        <w:t xml:space="preserve">하는 것을 제안합니다.</w:t>
+      </w:r>
+    </w:p>
+    <w:p>
+      <w:pPr>
+        <w:pStyle w:val="ListParagraph"/>
+        <w:numPr>
+          <w:ilvl w:val="0"/>
+          <w:numId w:val="2"/>
+        </w:numPr>
+        <w:spacing w:after="60"/>
+      </w:pPr>
+      <w:r>
+        <w:t xml:space="preserve">오류 code와 HTTP 상태 (예: </w:t>
+      </w:r>
+      <w:r>
+        <w:rPr>
+          <w:rFonts w:ascii="Consolas" w:cs="Consolas" w:eastAsia="Consolas" w:hAnsi="Consolas"/>
+          <w:sz w:val="19"/>
+          <w:szCs w:val="19"/>
+        </w:rPr>
+        <w:t xml:space="preserve">409 PHONE_ALREADY_REGISTERED</w:t>
+      </w:r>
+      <w:r>
+        <w:t xml:space="preserve">). 프론트는 이 code로 분기합니다.</w:t>
+      </w:r>
+    </w:p>
+    <w:p>
+      <w:pPr>
+        <w:pStyle w:val="ListParagraph"/>
+        <w:numPr>
+          <w:ilvl w:val="0"/>
+          <w:numId w:val="2"/>
+        </w:numPr>
+        <w:spacing w:after="60"/>
+      </w:pPr>
+      <w:r>
+        <w:t xml:space="preserve">마이페이지 연락처 변경(</w:t>
+      </w:r>
+      <w:r>
+        <w:rPr>
+          <w:rFonts w:ascii="Consolas" w:cs="Consolas" w:eastAsia="Consolas" w:hAnsi="Consolas"/>
+          <w:sz w:val="19"/>
+          <w:szCs w:val="19"/>
+        </w:rPr>
+        <w:t xml:space="preserve">PUT /me/contact</w:t>
+      </w:r>
+      <w:r>
+        <w:t xml:space="preserve">)에도 같은 제한을 적용하는지</w:t>
+      </w:r>
+    </w:p>
+    <w:p>
+      <w:pPr>
+        <w:pStyle w:val="ListParagraph"/>
+        <w:numPr>
+          <w:ilvl w:val="0"/>
+          <w:numId w:val="2"/>
+        </w:numPr>
+        <w:spacing w:after="60"/>
+      </w:pPr>
+      <w:r>
+        <w:t xml:space="preserve">이미 같은 번호로 가입된 기존 계정 처리 방법</w:t>
+      </w:r>
+    </w:p>
+    <w:p>
+      <w:pPr>
+        <w:spacing w:after="120"/>
+      </w:pPr>
+      <w:r>
+        <w:t xml:space="preserve">회신 예시: 번호 범위 ____ / 동일 번호 다중 가입 허용 여부 ____ / 거부 시점·오류 code ____ / 서버 변경 담당·목표 ____</w:t>
+      </w:r>
+    </w:p>
+    <w:p>
+      <w:pPr>
         <w:pStyle w:val="Heading1"/>
       </w:pPr>
       <w:r>
@@ -4871,7 +5757,27 @@
         <w:pStyle w:val="Heading2"/>
       </w:pPr>
       <w:r>
-        <w:t xml:space="preserve">C5·C6 결정이 필요한 것</w:t>
+        <w:t xml:space="preserve">결정·회신이 필요한 것</w:t>
+      </w:r>
+    </w:p>
+    <w:p>
+      <w:pPr>
+        <w:pStyle w:val="ListParagraph"/>
+        <w:numPr>
+          <w:ilvl w:val="0"/>
+          <w:numId w:val="2"/>
+        </w:numPr>
+        <w:spacing w:after="60"/>
+      </w:pPr>
+      <w:r>
+        <w:rPr>
+          <w:b/>
+          <w:bCs/>
+        </w:rPr>
+        <w:t xml:space="preserve">C2 전화번호 정책</w:t>
+      </w:r>
+      <w:r>
+        <w:t xml:space="preserve"> 확정 (2-2절, 프론트 제안은 현재 v6 유지)</w:t>
       </w:r>
     </w:p>
     <w:p>

</xml_diff>